<commit_message>
feat: validate live ad generation
</commit_message>
<xml_diff>
--- a/docs/report/FITROOM_PROJECT_REPORT.docx
+++ b/docs/report/FITROOM_PROJECT_REPORT.docx
@@ -135,7 +135,7 @@
                 <w:rFonts w:ascii="AppleGothic" w:hAnsi="AppleGothic" w:eastAsia="AppleGothic"/>
                 <w:sz w:val="17"/>
               </w:rPr>
-              <w:t>2026년 9월 25일</w:t>
+              <w:t>2026년 9월 29일</w:t>
             </w:r>
           </w:p>
         </w:tc>
@@ -225,7 +225,7 @@
                 <w:rFonts w:ascii="AppleGothic" w:hAnsi="AppleGothic" w:eastAsia="AppleGothic"/>
                 <w:sz w:val="17"/>
               </w:rPr>
-              <w:t>핵심 기능·배포·자동 검증 완료 / 실제 모델 품질 평가 대기</w:t>
+              <w:t>핵심 기능·배포·실제 모델 평가 완료 / 사용자 최종 확인 대기</w:t>
             </w:r>
           </w:p>
         </w:tc>
@@ -370,7 +370,7 @@
                 <w:rFonts w:ascii="AppleGothic" w:hAnsi="AppleGothic" w:eastAsia="AppleGothic"/>
                 <w:sz w:val="16"/>
               </w:rPr>
-              <w:t>68개 통과</w:t>
+              <w:t>72개 통과</w:t>
             </w:r>
           </w:p>
         </w:tc>
@@ -550,7 +550,7 @@
                 <w:rFonts w:ascii="AppleGothic" w:hAnsi="AppleGothic" w:eastAsia="AppleGothic"/>
                 <w:sz w:val="16"/>
               </w:rPr>
-              <w:t>활성 교육 API 프로젝트 확보 후 실행 예정</w:t>
+              <w:t>정상 4건 통과 · 평균 19.1초 · 사실 보존 5.00/5</w:t>
             </w:r>
           </w:p>
         </w:tc>
@@ -2577,7 +2577,7 @@
                 <w:rFonts w:ascii="AppleGothic" w:hAnsi="AppleGothic" w:eastAsia="AppleGothic"/>
                 <w:sz w:val="16"/>
               </w:rPr>
-              <w:t>17</w:t>
+              <w:t>21</w:t>
             </w:r>
           </w:p>
         </w:tc>
@@ -2710,7 +2710,7 @@
                 <w:rFonts w:ascii="AppleGothic" w:hAnsi="AppleGothic" w:eastAsia="AppleGothic"/>
                 <w:sz w:val="16"/>
               </w:rPr>
-              <w:t>68</w:t>
+              <w:t>72</w:t>
             </w:r>
           </w:p>
         </w:tc>
@@ -2821,7 +2821,7 @@
         <w:pStyle w:val="Heading1"/>
       </w:pPr>
       <w:r>
-        <w:t>9 모델 및 서비스 평가 계획</w:t>
+        <w:t>9 모델 및 서비스 평가 결과</w:t>
       </w:r>
     </w:p>
     <w:p>
@@ -2829,7 +2829,7 @@
         <w:rPr>
           <w:rFonts w:ascii="AppleGothic" w:hAnsi="AppleGothic" w:eastAsia="AppleGothic"/>
         </w:rPr>
-        <w:t>정상 입력 4건과 오류 입력 4건을 고정했다. 현재 교육용 API 키가 비활성 프로젝트에 연결되어 실제 생성 반복은 실행하지 못했다. 활성 프로젝트 키가 확보되면 같은 입력을 사용해 결과 원문, 응답 시간, 의심 표현과 사람 평가를 함께 기록한다.</w:t>
+        <w:t>2026년 9월 29일 활성 교육용 API 프로젝트에서 정상 입력 4건을 실제 생성하고 오류 입력 4건의 사전 거부를 확인했다. 정상 응답은 모두 구조 검사를 통과했고 평균 응답 시간은 19.1초, 범위는 14.8–22.5초였다. 미입력 성능 표현과 숫자 후보는 최종 자동 검사에서 0건이었다.</w:t>
       </w:r>
     </w:p>
     <w:tbl>
@@ -2991,7 +2991,7 @@
                 <w:rFonts w:ascii="AppleGothic" w:hAnsi="AppleGothic" w:eastAsia="AppleGothic"/>
                 <w:sz w:val="16"/>
               </w:rPr>
-              <w:t>측정 대기</w:t>
+              <w:t>보조 검토 5.00/5</w:t>
             </w:r>
           </w:p>
         </w:tc>
@@ -3059,7 +3059,7 @@
                 <w:rFonts w:ascii="AppleGothic" w:hAnsi="AppleGothic" w:eastAsia="AppleGothic"/>
                 <w:sz w:val="16"/>
               </w:rPr>
-              <w:t>측정 대기</w:t>
+              <w:t>보조 검토 3.75/5</w:t>
             </w:r>
           </w:p>
         </w:tc>
@@ -3082,7 +3082,7 @@
                 <w:rFonts w:ascii="AppleGothic" w:hAnsi="AppleGothic" w:eastAsia="AppleGothic"/>
                 <w:sz w:val="16"/>
               </w:rPr>
-              <w:t>일관성</w:t>
+              <w:t>형식 일관성</w:t>
             </w:r>
           </w:p>
         </w:tc>
@@ -3103,7 +3103,7 @@
                 <w:rFonts w:ascii="AppleGothic" w:hAnsi="AppleGothic" w:eastAsia="AppleGothic"/>
                 <w:sz w:val="16"/>
               </w:rPr>
-              <w:t>반복 생성에서도 형식과 관점 구분을 유지하는가</w:t>
+              <w:t>세 관점과 필수 필드를 유지하는가</w:t>
             </w:r>
           </w:p>
         </w:tc>
@@ -3124,7 +3124,7 @@
                 <w:rFonts w:ascii="AppleGothic" w:hAnsi="AppleGothic" w:eastAsia="AppleGothic"/>
                 <w:sz w:val="16"/>
               </w:rPr>
-              <w:t>측정 대기</w:t>
+              <w:t>4/4건 통과</w:t>
             </w:r>
           </w:p>
         </w:tc>
@@ -3192,7 +3192,7 @@
                 <w:rFonts w:ascii="AppleGothic" w:hAnsi="AppleGothic" w:eastAsia="AppleGothic"/>
                 <w:sz w:val="16"/>
               </w:rPr>
-              <w:t>측정 대기</w:t>
+              <w:t>평균 19.1초</w:t>
             </w:r>
           </w:p>
         </w:tc>
@@ -3257,7 +3257,7 @@
                 <w:rFonts w:ascii="AppleGothic" w:hAnsi="AppleGothic" w:eastAsia="AppleGothic"/>
                 <w:sz w:val="16"/>
               </w:rPr>
-              <w:t>측정 대기</w:t>
+              <w:t>보조 검토 4.00/5</w:t>
             </w:r>
           </w:p>
         </w:tc>
@@ -3267,6 +3267,14 @@
       <w:pPr>
         <w:spacing w:after="0"/>
       </w:pPr>
+    </w:p>
+    <w:p>
+      <w:r>
+        <w:rPr>
+          <w:rFonts w:ascii="AppleGothic" w:hAnsi="AppleGothic" w:eastAsia="AppleGothic"/>
+        </w:rPr>
+        <w:t>첫 실행에서는 모델이 해시태그에 #과 구두점을 붙여 엄격 검증에서 거부됐다. 표시용 해시태그만 정규화한 뒤 기존 검사를 다시 적용해 해결했다. 보조 검토 점수는 사용자가 승인하거나 수정해야 사람 평가로 확정된다.</w:t>
+      </w:r>
     </w:p>
     <w:p>
       <w:pPr>
@@ -3665,7 +3673,7 @@
                 <w:rFonts w:ascii="AppleGothic" w:hAnsi="AppleGothic" w:eastAsia="AppleGothic"/>
                 <w:sz w:val="16"/>
               </w:rPr>
-              <w:t>68개 자동 검사와 타입·린트·빌드 기록</w:t>
+              <w:t>72개 자동 검사와 타입·린트·빌드 기록</w:t>
             </w:r>
           </w:p>
         </w:tc>
@@ -3694,7 +3702,7 @@
           <w:rFonts w:ascii="AppleGothic" w:hAnsi="AppleGothic" w:eastAsia="AppleGothic"/>
           <w:sz w:val="18"/>
         </w:rPr>
-        <w:t>실제 API 생성 품질과 소상공인 사용성 평가가 아직 없다.</w:t>
+        <w:t>실제 API 생성은 평가했지만 사용자 확정 평가와 소상공인 사용성 테스트가 아직 없다.</w:t>
       </w:r>
     </w:p>
     <w:p>
@@ -3767,7 +3775,7 @@
           <w:rFonts w:ascii="AppleGothic" w:hAnsi="AppleGothic" w:eastAsia="AppleGothic"/>
           <w:sz w:val="18"/>
         </w:rPr>
-        <w:t>활성 API 키로 고정 입력 평가를 실행하고 사실 오류·수정량·응답 시간을 기록한다.</w:t>
+        <w:t>사용자가 생성 원문과 보조 점수를 확인해 사람 평가를 확정한다.</w:t>
       </w:r>
     </w:p>
     <w:p>
@@ -3925,7 +3933,7 @@
           <w:rFonts w:ascii="AppleGothic" w:hAnsi="AppleGothic" w:eastAsia="AppleGothic"/>
           <w:sz w:val="18"/>
         </w:rPr>
-        <w:t>활성 교육용 OpenAI API 프로젝트 키 연결과 고정 입력 4건 평가</w:t>
+        <w:t>배포 환경에 OpenAI API 비밀값 연결과 실제 사이트 생성 확인</w:t>
       </w:r>
     </w:p>
     <w:p>

</xml_diff>

<commit_message>
fix: stabilize fitting flows and refresh report
</commit_message>
<xml_diff>
--- a/docs/report/FITROOM_PROJECT_REPORT.docx
+++ b/docs/report/FITROOM_PROJECT_REPORT.docx
@@ -370,7 +370,7 @@
                 <w:rFonts w:ascii="AppleGothic" w:hAnsi="AppleGothic" w:eastAsia="AppleGothic"/>
                 <w:sz w:val="16"/>
               </w:rPr>
-              <w:t>72개 통과</w:t>
+              <w:t>102개 통과</w:t>
             </w:r>
           </w:p>
         </w:tc>
@@ -2322,7 +2322,33 @@
           <w:rFonts w:ascii="AppleGothic" w:hAnsi="AppleGothic" w:eastAsia="AppleGothic"/>
           <w:sz w:val="18"/>
         </w:rPr>
-        <w:t>이용자는 드래그 또는 버튼으로 모자·상의·하의를 입히고 같은 부위의 옷을 교체한다.</w:t>
+        <w:t>이용자는 상품 카드 클릭·드래그 또는 버튼으로 모자·상의·하의를 입히고, 입은 상품이나 아바타의 의상을 눌러 벗는다.</w:t>
+      </w:r>
+    </w:p>
+    <w:p>
+      <w:pPr>
+        <w:pStyle w:val="ListBullet"/>
+        <w:spacing w:after="40"/>
+      </w:pPr>
+      <w:r>
+        <w:rPr>
+          <w:rFonts w:ascii="AppleGothic" w:hAnsi="AppleGothic" w:eastAsia="AppleGothic"/>
+          <w:sz w:val="18"/>
+        </w:rPr>
+        <w:t>판매자 사진의 대표색과 상품명·특징에서 판별한 셔츠·카펜터 형태를 참고 의상에 반영한다.</w:t>
+      </w:r>
+    </w:p>
+    <w:p>
+      <w:pPr>
+        <w:pStyle w:val="ListBullet"/>
+        <w:spacing w:after="40"/>
+      </w:pPr>
+      <w:r>
+        <w:rPr>
+          <w:rFonts w:ascii="AppleGothic" w:hAnsi="AppleGothic" w:eastAsia="AppleGothic"/>
+          <w:sz w:val="18"/>
+        </w:rPr>
+        <w:t>흰 배경에 평면 촬영한 상의는 사용자가 선택하면 앞면 무늬를 현재 브라우저 탭의 3D 상의에 적용한다.</w:t>
       </w:r>
     </w:p>
     <w:p>
@@ -2489,7 +2515,7 @@
                 <w:rFonts w:ascii="AppleGothic" w:hAnsi="AppleGothic" w:eastAsia="AppleGothic"/>
                 <w:sz w:val="16"/>
               </w:rPr>
-              <w:t>판매자 상품·가상 매장·계정 작업 공간</w:t>
+              <w:t>판매자 상품·매장·게시·사진·의상 판별</w:t>
             </w:r>
           </w:p>
         </w:tc>
@@ -2510,7 +2536,7 @@
                 <w:rFonts w:ascii="AppleGothic" w:hAnsi="AppleGothic" w:eastAsia="AppleGothic"/>
                 <w:sz w:val="16"/>
               </w:rPr>
-              <w:t>17</w:t>
+              <w:t>30</w:t>
             </w:r>
           </w:p>
         </w:tc>
@@ -2555,7 +2581,7 @@
                 <w:rFonts w:ascii="AppleGothic" w:hAnsi="AppleGothic" w:eastAsia="AppleGothic"/>
                 <w:sz w:val="16"/>
               </w:rPr>
-              <w:t>광고 계약·API·평가 저장·오류 처리</w:t>
+              <w:t>광고 계약·API·평가·등록 상품 변환</w:t>
             </w:r>
           </w:p>
         </w:tc>
@@ -2577,7 +2603,7 @@
                 <w:rFonts w:ascii="AppleGothic" w:hAnsi="AppleGothic" w:eastAsia="AppleGothic"/>
                 <w:sz w:val="16"/>
               </w:rPr>
-              <w:t>21</w:t>
+              <w:t>23</w:t>
             </w:r>
           </w:p>
         </w:tc>
@@ -2622,7 +2648,7 @@
                 <w:rFonts w:ascii="AppleGothic" w:hAnsi="AppleGothic" w:eastAsia="AppleGothic"/>
                 <w:sz w:val="16"/>
               </w:rPr>
-              <w:t>3D 피팅룸·공개 카탈로그·보관함·사진 처리</w:t>
+              <w:t>3D 피팅룸·카탈로그·추천·사진·마네킹 핏</w:t>
             </w:r>
           </w:p>
         </w:tc>
@@ -2643,7 +2669,7 @@
                 <w:rFonts w:ascii="AppleGothic" w:hAnsi="AppleGothic" w:eastAsia="AppleGothic"/>
                 <w:sz w:val="16"/>
               </w:rPr>
-              <w:t>34</w:t>
+              <w:t>49</w:t>
             </w:r>
           </w:p>
         </w:tc>
@@ -2710,7 +2736,7 @@
                 <w:rFonts w:ascii="AppleGothic" w:hAnsi="AppleGothic" w:eastAsia="AppleGothic"/>
                 <w:sz w:val="16"/>
               </w:rPr>
-              <w:t>72</w:t>
+              <w:t>102</w:t>
             </w:r>
           </w:p>
         </w:tc>
@@ -2806,6 +2832,32 @@
           <w:sz w:val="18"/>
         </w:rPr>
         <w:t>배포된 공개 카탈로그 API의 HTTP 200 응답 확인</w:t>
+      </w:r>
+    </w:p>
+    <w:p>
+      <w:pPr>
+        <w:pStyle w:val="ListBullet"/>
+        <w:spacing w:after="40"/>
+      </w:pPr>
+      <w:r>
+        <w:rPr>
+          <w:rFonts w:ascii="AppleGothic" w:hAnsi="AppleGothic" w:eastAsia="AppleGothic"/>
+          <w:sz w:val="18"/>
+        </w:rPr>
+        <w:t>마네킹 핏 검사 10건에서 허용 노출률 이내인지 확인</w:t>
+      </w:r>
+    </w:p>
+    <w:p>
+      <w:pPr>
+        <w:pStyle w:val="ListBullet"/>
+        <w:spacing w:after="40"/>
+      </w:pPr>
+      <w:r>
+        <w:rPr>
+          <w:rFonts w:ascii="AppleGothic" w:hAnsi="AppleGothic" w:eastAsia="AppleGothic"/>
+          <w:sz w:val="18"/>
+        </w:rPr>
+        <w:t>iCloud 밖의 새 폴더에서 설치·테스트·타입 검사·프로덕션 빌드 재현</w:t>
       </w:r>
     </w:p>
     <w:p>
@@ -3307,7 +3359,7 @@
           <w:rFonts w:ascii="AppleGothic" w:hAnsi="AppleGothic" w:eastAsia="AppleGothic"/>
           <w:sz w:val="18"/>
         </w:rPr>
-        <w:t>상품 사진은 AI 요청과 서버 저장에서 제외한다.</w:t>
+        <w:t>상품 사진은 AI 요청과 서버 저장에서 제외하고, 대표색과 앞면 무늬 처리는 브라우저에서만 수행한다.</w:t>
       </w:r>
     </w:p>
     <w:p>
@@ -3673,7 +3725,7 @@
                 <w:rFonts w:ascii="AppleGothic" w:hAnsi="AppleGothic" w:eastAsia="AppleGothic"/>
                 <w:sz w:val="16"/>
               </w:rPr>
-              <w:t>72개 자동 검사와 타입·린트·빌드 기록</w:t>
+              <w:t>102개 자동 검사와 타입·린트·빌드 기록</w:t>
             </w:r>
           </w:p>
         </w:tc>
@@ -3754,7 +3806,33 @@
           <w:rFonts w:ascii="AppleGothic" w:hAnsi="AppleGothic" w:eastAsia="AppleGothic"/>
           <w:sz w:val="18"/>
         </w:rPr>
-        <w:t>3D 의상은 실제 원단·주름·착용 결과를 재현하지 않는다.</w:t>
+        <w:t>3D 의상은 일부 색상·형태·상의 앞면 무늬만 반영하며 실제 원단·주름·착용 결과를 재현하지 않는다.</w:t>
+      </w:r>
+    </w:p>
+    <w:p>
+      <w:pPr>
+        <w:pStyle w:val="ListBullet"/>
+        <w:spacing w:after="40"/>
+      </w:pPr>
+      <w:r>
+        <w:rPr>
+          <w:rFonts w:ascii="AppleGothic" w:hAnsi="AppleGothic" w:eastAsia="AppleGothic"/>
+          <w:sz w:val="18"/>
+        </w:rPr>
+        <w:t>상의 앞면 무늬는 현재 탭에서만 유지되고 다른 기기·이용자에게 전달되지 않는다.</w:t>
+      </w:r>
+    </w:p>
+    <w:p>
+      <w:pPr>
+        <w:pStyle w:val="ListBullet"/>
+        <w:spacing w:after="40"/>
+      </w:pPr>
+      <w:r>
+        <w:rPr>
+          <w:rFonts w:ascii="AppleGothic" w:hAnsi="AppleGothic" w:eastAsia="AppleGothic"/>
+          <w:sz w:val="18"/>
+        </w:rPr>
+        <w:t>프로젝트 폴더가 iCloud 동기화 대상이면 큰 파일이 비워져 개발 서버와 빌드가 멈출 수 있다.</w:t>
       </w:r>
     </w:p>
     <w:p>
@@ -3912,7 +3990,7 @@
         <w:rPr>
           <w:rFonts w:ascii="AppleGothic" w:hAnsi="AppleGothic" w:eastAsia="AppleGothic"/>
         </w:rPr>
-        <w:t>Codex의 GPT-6 기반 코딩 에이전트는 요구사항 정리, UI·서버 코드 작성, 테스트, 브라우저 검증, 문서 초안을 지원했다. 사용자는 서비스 방향, 대상 사용자, 가상 매장 경험, 일정과 교육 API 사용 가능 여부를 결정했다. 개인 업무일지의 배운 점과 소감은 사용자가 자신의 경험으로 보완한다.</w:t>
+        <w:t>Codex의 GPT-6 기반 코딩 에이전트는 요구사항 정리, UI·서버 코드 작성, 테스트, 브라우저 검증, 문서 초안을 지원했다. 2026년 9월 29일에는 Claude Code(Claude Sonnet 5.5)가 결함 수정, 클릭 착용·탈착, 마네킹 핏 검사, 사진 대표색과 상의 앞면 무늬 처리, 문서 정리를 지원했다. 사용자는 서비스 방향, 대상 사용자, 가상 매장 경험, 일정과 교육 API 사용 가능 여부를 결정했다. 개인 업무일지의 배운 점과 소감은 사용자가 자신의 경험으로 보완한다.</w:t>
       </w:r>
     </w:p>
     <w:p>

</xml_diff>

<commit_message>
feat: rewrite the ad prompt with tone, purpose and closing-line guidance and add style checks
The 9/29 real-model run passed structure and fact checks, but re-reading the
12 drafts showed the seller's request copied into the text, no new-arrival
wording, repeated sentences and closing lines, and a weak energetic tone.
The prompt only received tone/purpose/cta as enum values with no guidance.

- prompt 2026-09-30.1: per-value guidance, no request quoting, no field lists
- automaticReview.styleReview: request echo, missing purpose, repeats
- two evaluation inputs whose extra request conflicted with the tone adjusted
- report, journal and evaluation docs updated; the revised prompt has not been
  run against the real model yet

Co-Authored-By: Claude Sonnet 5.5 <noreply@anthropic.com>
</commit_message>
<xml_diff>
--- a/docs/report/FITROOM_PROJECT_REPORT.docx
+++ b/docs/report/FITROOM_PROJECT_REPORT.docx
@@ -370,7 +370,7 @@
                 <w:rFonts w:ascii="AppleGothic" w:hAnsi="AppleGothic" w:eastAsia="AppleGothic"/>
                 <w:sz w:val="16"/>
               </w:rPr>
-              <w:t>102개 통과</w:t>
+              <w:t>106개 통과</w:t>
             </w:r>
           </w:p>
         </w:tc>
@@ -2581,7 +2581,7 @@
                 <w:rFonts w:ascii="AppleGothic" w:hAnsi="AppleGothic" w:eastAsia="AppleGothic"/>
                 <w:sz w:val="16"/>
               </w:rPr>
-              <w:t>광고 계약·API·평가·등록 상품 변환</w:t>
+              <w:t>광고 계약·프롬프트·API·평가·등록 상품 변환</w:t>
             </w:r>
           </w:p>
         </w:tc>
@@ -2603,7 +2603,7 @@
                 <w:rFonts w:ascii="AppleGothic" w:hAnsi="AppleGothic" w:eastAsia="AppleGothic"/>
                 <w:sz w:val="16"/>
               </w:rPr>
-              <w:t>23</w:t>
+              <w:t>27</w:t>
             </w:r>
           </w:p>
         </w:tc>
@@ -2736,7 +2736,7 @@
                 <w:rFonts w:ascii="AppleGothic" w:hAnsi="AppleGothic" w:eastAsia="AppleGothic"/>
                 <w:sz w:val="16"/>
               </w:rPr>
-              <w:t>102</w:t>
+              <w:t>106</w:t>
             </w:r>
           </w:p>
         </w:tc>
@@ -3329,6 +3329,14 @@
       </w:r>
     </w:p>
     <w:p>
+      <w:r>
+        <w:rPr>
+          <w:rFonts w:ascii="AppleGothic" w:hAnsi="AppleGothic" w:eastAsia="AppleGothic"/>
+        </w:rPr>
+        <w:t>이 결과는 프롬프트 2026-09-16.1 기준이다. 12개 초안을 다시 읽어 판매자 요청 문장의 본문 인용, 신상 표현 누락, 초안 간 반복 문장·같은 마지막 안내, 항목 나열식 문장을 확인했고, 말투·목적·마지막 안내 값별 기준을 넣은 2026-09-30.1 판으로 프롬프트를 고쳤다. 자동 검사에도 같은 항목을 찾는 검사를 추가했다. 개정판을 실제 모델로 평가한 결과는 아직 없다.</w:t>
+      </w:r>
+    </w:p>
+    <w:p>
       <w:pPr>
         <w:pStyle w:val="Heading1"/>
       </w:pPr>
@@ -3725,7 +3733,7 @@
                 <w:rFonts w:ascii="AppleGothic" w:hAnsi="AppleGothic" w:eastAsia="AppleGothic"/>
                 <w:sz w:val="16"/>
               </w:rPr>
-              <w:t>102개 자동 검사와 타입·린트·빌드 기록</w:t>
+              <w:t>106개 자동 검사와 타입·린트·빌드 기록</w:t>
             </w:r>
           </w:p>
         </w:tc>

</xml_diff>

<commit_message>
feat: revise the ad prompt again after re-evaluation and record three real-model runs
Re-running the four fixed inputs with prompt 2026-09-30.1 removed the format
problems but introduced a list-price mislabel and unprovided comfort claims.
Prompt 2026-09-30.2 states that priceKrw is already the discounted selling
price and forbids comfort claims and talk about missing input.

- automatic review flags list-price wording, comfort claims and missing-input talk
- evaluation script keeps going after a failed case and records the failure
- runs of 2026-09-30 saved next to the 9/29 run; report, journal and validation
  record compare the three runs and state the limits (not a human rating, same
  four inputs used to choose the fixes, reasoning effort differs)

Co-Authored-By: Claude Sonnet 5.5 <noreply@anthropic.com>
</commit_message>
<xml_diff>
--- a/docs/report/FITROOM_PROJECT_REPORT.docx
+++ b/docs/report/FITROOM_PROJECT_REPORT.docx
@@ -370,7 +370,7 @@
                 <w:rFonts w:ascii="AppleGothic" w:hAnsi="AppleGothic" w:eastAsia="AppleGothic"/>
                 <w:sz w:val="16"/>
               </w:rPr>
-              <w:t>106개 통과</w:t>
+              <w:t>108개 통과</w:t>
             </w:r>
           </w:p>
         </w:tc>
@@ -2603,7 +2603,7 @@
                 <w:rFonts w:ascii="AppleGothic" w:hAnsi="AppleGothic" w:eastAsia="AppleGothic"/>
                 <w:sz w:val="16"/>
               </w:rPr>
-              <w:t>27</w:t>
+              <w:t>29</w:t>
             </w:r>
           </w:p>
         </w:tc>
@@ -2736,7 +2736,7 @@
                 <w:rFonts w:ascii="AppleGothic" w:hAnsi="AppleGothic" w:eastAsia="AppleGothic"/>
                 <w:sz w:val="16"/>
               </w:rPr>
-              <w:t>106</w:t>
+              <w:t>108</w:t>
             </w:r>
           </w:p>
         </w:tc>
@@ -3333,7 +3333,770 @@
         <w:rPr>
           <w:rFonts w:ascii="AppleGothic" w:hAnsi="AppleGothic" w:eastAsia="AppleGothic"/>
         </w:rPr>
-        <w:t>이 결과는 프롬프트 2026-09-16.1 기준이다. 12개 초안을 다시 읽어 판매자 요청 문장의 본문 인용, 신상 표현 누락, 초안 간 반복 문장·같은 마지막 안내, 항목 나열식 문장을 확인했고, 말투·목적·마지막 안내 값별 기준을 넣은 2026-09-30.1 판으로 프롬프트를 고쳤다. 자동 검사에도 같은 항목을 찾는 검사를 추가했다. 개정판을 실제 모델로 평가한 결과는 아직 없다.</w:t>
+        <w:t>상단 표의 수치는 프롬프트 2026-09-16.1(1차) 기준이다. 12개 초안을 다시 읽어 판매자 요청 문장의 본문 인용, 신상 표현 누락, 초안 간 반복 문장·같은 마지막 안내, 항목 나열식 문장을 확인했고, 말투·목적·마지막 안내 값별 기준을 넣어 프롬프트를 두 번 고친 뒤 같은 4개 입력을 다시 생성했다. 자동 검사에도 같은 항목을 찾는 검사를 추가했다.</w:t>
+      </w:r>
+    </w:p>
+    <w:tbl>
+      <w:tblPr>
+        <w:tblStyle w:val="TableGrid"/>
+        <w:tblW w:type="auto" w:w="0"/>
+        <w:jc w:val="center"/>
+        <w:tblLayout w:type="fixed"/>
+        <w:tblLook w:firstColumn="1" w:firstRow="1" w:lastColumn="0" w:lastRow="0" w:noHBand="0" w:noVBand="1" w:val="04A0"/>
+      </w:tblPr>
+      <w:tblGrid>
+        <w:gridCol w:w="2493"/>
+        <w:gridCol w:w="2493"/>
+        <w:gridCol w:w="2493"/>
+        <w:gridCol w:w="2493"/>
+      </w:tblGrid>
+      <w:tr>
+        <w:trPr>
+          <w:tblHeader w:val="true"/>
+        </w:trPr>
+        <w:tc>
+          <w:tcPr>
+            <w:tcW w:type="dxa" w:w="3061"/>
+            <w:shd w:fill="121826"/>
+            <w:tcMar>
+              <w:top w:w="100" w:type="dxa"/>
+              <w:start w:w="120" w:type="dxa"/>
+              <w:bottom w:w="100" w:type="dxa"/>
+              <w:end w:w="120" w:type="dxa"/>
+            </w:tcMar>
+            <w:vAlign w:val="center"/>
+          </w:tcPr>
+          <w:p>
+            <w:pPr>
+              <w:jc w:val="left"/>
+            </w:pPr>
+            <w:r>
+              <w:rPr>
+                <w:rFonts w:ascii="AppleGothic" w:hAnsi="AppleGothic" w:eastAsia="AppleGothic"/>
+                <w:b/>
+                <w:color w:val="FFFFFF"/>
+                <w:sz w:val="16"/>
+              </w:rPr>
+              <w:t>항목</w:t>
+            </w:r>
+          </w:p>
+        </w:tc>
+        <w:tc>
+          <w:tcPr>
+            <w:tcW w:type="dxa" w:w="2098"/>
+            <w:shd w:fill="121826"/>
+            <w:tcMar>
+              <w:top w:w="100" w:type="dxa"/>
+              <w:start w:w="120" w:type="dxa"/>
+              <w:bottom w:w="100" w:type="dxa"/>
+              <w:end w:w="120" w:type="dxa"/>
+            </w:tcMar>
+            <w:vAlign w:val="center"/>
+          </w:tcPr>
+          <w:p>
+            <w:pPr>
+              <w:jc w:val="left"/>
+            </w:pPr>
+            <w:r>
+              <w:rPr>
+                <w:rFonts w:ascii="AppleGothic" w:hAnsi="AppleGothic" w:eastAsia="AppleGothic"/>
+                <w:b/>
+                <w:color w:val="FFFFFF"/>
+                <w:sz w:val="16"/>
+              </w:rPr>
+              <w:t>1차 (09-16.1)</w:t>
+            </w:r>
+          </w:p>
+        </w:tc>
+        <w:tc>
+          <w:tcPr>
+            <w:tcW w:type="dxa" w:w="2098"/>
+            <w:shd w:fill="121826"/>
+            <w:tcMar>
+              <w:top w:w="100" w:type="dxa"/>
+              <w:start w:w="120" w:type="dxa"/>
+              <w:bottom w:w="100" w:type="dxa"/>
+              <w:end w:w="120" w:type="dxa"/>
+            </w:tcMar>
+            <w:vAlign w:val="center"/>
+          </w:tcPr>
+          <w:p>
+            <w:pPr>
+              <w:jc w:val="left"/>
+            </w:pPr>
+            <w:r>
+              <w:rPr>
+                <w:rFonts w:ascii="AppleGothic" w:hAnsi="AppleGothic" w:eastAsia="AppleGothic"/>
+                <w:b/>
+                <w:color w:val="FFFFFF"/>
+                <w:sz w:val="16"/>
+              </w:rPr>
+              <w:t>2차 (09-30.1)</w:t>
+            </w:r>
+          </w:p>
+        </w:tc>
+        <w:tc>
+          <w:tcPr>
+            <w:tcW w:type="dxa" w:w="2098"/>
+            <w:shd w:fill="121826"/>
+            <w:tcMar>
+              <w:top w:w="100" w:type="dxa"/>
+              <w:start w:w="120" w:type="dxa"/>
+              <w:bottom w:w="100" w:type="dxa"/>
+              <w:end w:w="120" w:type="dxa"/>
+            </w:tcMar>
+            <w:vAlign w:val="center"/>
+          </w:tcPr>
+          <w:p>
+            <w:pPr>
+              <w:jc w:val="left"/>
+            </w:pPr>
+            <w:r>
+              <w:rPr>
+                <w:rFonts w:ascii="AppleGothic" w:hAnsi="AppleGothic" w:eastAsia="AppleGothic"/>
+                <w:b/>
+                <w:color w:val="FFFFFF"/>
+                <w:sz w:val="16"/>
+              </w:rPr>
+              <w:t>3차 (09-30.2)</w:t>
+            </w:r>
+          </w:p>
+        </w:tc>
+      </w:tr>
+      <w:tr>
+        <w:tc>
+          <w:tcPr>
+            <w:tcW w:type="dxa" w:w="3061"/>
+            <w:tcMar>
+              <w:top w:w="100" w:type="dxa"/>
+              <w:start w:w="120" w:type="dxa"/>
+              <w:bottom w:w="100" w:type="dxa"/>
+              <w:end w:w="120" w:type="dxa"/>
+            </w:tcMar>
+            <w:vAlign w:val="center"/>
+          </w:tcPr>
+          <w:p>
+            <w:r>
+              <w:rPr>
+                <w:rFonts w:ascii="AppleGothic" w:hAnsi="AppleGothic" w:eastAsia="AppleGothic"/>
+                <w:sz w:val="16"/>
+              </w:rPr>
+              <w:t>평균 응답 시간(범위)</w:t>
+            </w:r>
+          </w:p>
+        </w:tc>
+        <w:tc>
+          <w:tcPr>
+            <w:tcW w:type="dxa" w:w="2098"/>
+            <w:tcMar>
+              <w:top w:w="100" w:type="dxa"/>
+              <w:start w:w="120" w:type="dxa"/>
+              <w:bottom w:w="100" w:type="dxa"/>
+              <w:end w:w="120" w:type="dxa"/>
+            </w:tcMar>
+            <w:vAlign w:val="center"/>
+          </w:tcPr>
+          <w:p>
+            <w:r>
+              <w:rPr>
+                <w:rFonts w:ascii="AppleGothic" w:hAnsi="AppleGothic" w:eastAsia="AppleGothic"/>
+                <w:sz w:val="16"/>
+              </w:rPr>
+              <w:t>19.1초 (14.8–22.5)</w:t>
+            </w:r>
+          </w:p>
+        </w:tc>
+        <w:tc>
+          <w:tcPr>
+            <w:tcW w:type="dxa" w:w="2098"/>
+            <w:tcMar>
+              <w:top w:w="100" w:type="dxa"/>
+              <w:start w:w="120" w:type="dxa"/>
+              <w:bottom w:w="100" w:type="dxa"/>
+              <w:end w:w="120" w:type="dxa"/>
+            </w:tcMar>
+            <w:vAlign w:val="center"/>
+          </w:tcPr>
+          <w:p>
+            <w:r>
+              <w:rPr>
+                <w:rFonts w:ascii="AppleGothic" w:hAnsi="AppleGothic" w:eastAsia="AppleGothic"/>
+                <w:sz w:val="16"/>
+              </w:rPr>
+              <w:t>6.6초 (5.7–7.6)</w:t>
+            </w:r>
+          </w:p>
+        </w:tc>
+        <w:tc>
+          <w:tcPr>
+            <w:tcW w:type="dxa" w:w="2098"/>
+            <w:tcMar>
+              <w:top w:w="100" w:type="dxa"/>
+              <w:start w:w="120" w:type="dxa"/>
+              <w:bottom w:w="100" w:type="dxa"/>
+              <w:end w:w="120" w:type="dxa"/>
+            </w:tcMar>
+            <w:vAlign w:val="center"/>
+          </w:tcPr>
+          <w:p>
+            <w:r>
+              <w:rPr>
+                <w:rFonts w:ascii="AppleGothic" w:hAnsi="AppleGothic" w:eastAsia="AppleGothic"/>
+                <w:sz w:val="16"/>
+              </w:rPr>
+              <w:t>6.7초 (5.3–8.1)</w:t>
+            </w:r>
+          </w:p>
+        </w:tc>
+      </w:tr>
+      <w:tr>
+        <w:tc>
+          <w:tcPr>
+            <w:tcW w:type="dxa" w:w="3061"/>
+            <w:tcMar>
+              <w:top w:w="100" w:type="dxa"/>
+              <w:start w:w="120" w:type="dxa"/>
+              <w:bottom w:w="100" w:type="dxa"/>
+              <w:end w:w="120" w:type="dxa"/>
+            </w:tcMar>
+            <w:vAlign w:val="center"/>
+            <w:shd w:fill="F7F9FC"/>
+          </w:tcPr>
+          <w:p>
+            <w:r>
+              <w:rPr>
+                <w:rFonts w:ascii="AppleGothic" w:hAnsi="AppleGothic" w:eastAsia="AppleGothic"/>
+                <w:sz w:val="16"/>
+              </w:rPr>
+              <w:t>판매자 요청 문장 인용</w:t>
+            </w:r>
+          </w:p>
+        </w:tc>
+        <w:tc>
+          <w:tcPr>
+            <w:tcW w:type="dxa" w:w="2098"/>
+            <w:tcMar>
+              <w:top w:w="100" w:type="dxa"/>
+              <w:start w:w="120" w:type="dxa"/>
+              <w:bottom w:w="100" w:type="dxa"/>
+              <w:end w:w="120" w:type="dxa"/>
+            </w:tcMar>
+            <w:vAlign w:val="center"/>
+            <w:shd w:fill="F7F9FC"/>
+          </w:tcPr>
+          <w:p>
+            <w:r>
+              <w:rPr>
+                <w:rFonts w:ascii="AppleGothic" w:hAnsi="AppleGothic" w:eastAsia="AppleGothic"/>
+                <w:sz w:val="16"/>
+              </w:rPr>
+              <w:t>1/4건</w:t>
+            </w:r>
+          </w:p>
+        </w:tc>
+        <w:tc>
+          <w:tcPr>
+            <w:tcW w:type="dxa" w:w="2098"/>
+            <w:tcMar>
+              <w:top w:w="100" w:type="dxa"/>
+              <w:start w:w="120" w:type="dxa"/>
+              <w:bottom w:w="100" w:type="dxa"/>
+              <w:end w:w="120" w:type="dxa"/>
+            </w:tcMar>
+            <w:vAlign w:val="center"/>
+            <w:shd w:fill="F7F9FC"/>
+          </w:tcPr>
+          <w:p>
+            <w:r>
+              <w:rPr>
+                <w:rFonts w:ascii="AppleGothic" w:hAnsi="AppleGothic" w:eastAsia="AppleGothic"/>
+                <w:sz w:val="16"/>
+              </w:rPr>
+              <w:t>0/4건</w:t>
+            </w:r>
+          </w:p>
+        </w:tc>
+        <w:tc>
+          <w:tcPr>
+            <w:tcW w:type="dxa" w:w="2098"/>
+            <w:tcMar>
+              <w:top w:w="100" w:type="dxa"/>
+              <w:start w:w="120" w:type="dxa"/>
+              <w:bottom w:w="100" w:type="dxa"/>
+              <w:end w:w="120" w:type="dxa"/>
+            </w:tcMar>
+            <w:vAlign w:val="center"/>
+            <w:shd w:fill="F7F9FC"/>
+          </w:tcPr>
+          <w:p>
+            <w:r>
+              <w:rPr>
+                <w:rFonts w:ascii="AppleGothic" w:hAnsi="AppleGothic" w:eastAsia="AppleGothic"/>
+                <w:sz w:val="16"/>
+              </w:rPr>
+              <w:t>0/4건</w:t>
+            </w:r>
+          </w:p>
+        </w:tc>
+      </w:tr>
+      <w:tr>
+        <w:tc>
+          <w:tcPr>
+            <w:tcW w:type="dxa" w:w="3061"/>
+            <w:tcMar>
+              <w:top w:w="100" w:type="dxa"/>
+              <w:start w:w="120" w:type="dxa"/>
+              <w:bottom w:w="100" w:type="dxa"/>
+              <w:end w:w="120" w:type="dxa"/>
+            </w:tcMar>
+            <w:vAlign w:val="center"/>
+          </w:tcPr>
+          <w:p>
+            <w:r>
+              <w:rPr>
+                <w:rFonts w:ascii="AppleGothic" w:hAnsi="AppleGothic" w:eastAsia="AppleGothic"/>
+                <w:sz w:val="16"/>
+              </w:rPr>
+              <w:t>신상 표현 누락(신상 입력 1건)</w:t>
+            </w:r>
+          </w:p>
+        </w:tc>
+        <w:tc>
+          <w:tcPr>
+            <w:tcW w:type="dxa" w:w="2098"/>
+            <w:tcMar>
+              <w:top w:w="100" w:type="dxa"/>
+              <w:start w:w="120" w:type="dxa"/>
+              <w:bottom w:w="100" w:type="dxa"/>
+              <w:end w:w="120" w:type="dxa"/>
+            </w:tcMar>
+            <w:vAlign w:val="center"/>
+          </w:tcPr>
+          <w:p>
+            <w:r>
+              <w:rPr>
+                <w:rFonts w:ascii="AppleGothic" w:hAnsi="AppleGothic" w:eastAsia="AppleGothic"/>
+                <w:sz w:val="16"/>
+              </w:rPr>
+              <w:t>1/1건</w:t>
+            </w:r>
+          </w:p>
+        </w:tc>
+        <w:tc>
+          <w:tcPr>
+            <w:tcW w:type="dxa" w:w="2098"/>
+            <w:tcMar>
+              <w:top w:w="100" w:type="dxa"/>
+              <w:start w:w="120" w:type="dxa"/>
+              <w:bottom w:w="100" w:type="dxa"/>
+              <w:end w:w="120" w:type="dxa"/>
+            </w:tcMar>
+            <w:vAlign w:val="center"/>
+          </w:tcPr>
+          <w:p>
+            <w:r>
+              <w:rPr>
+                <w:rFonts w:ascii="AppleGothic" w:hAnsi="AppleGothic" w:eastAsia="AppleGothic"/>
+                <w:sz w:val="16"/>
+              </w:rPr>
+              <w:t>0/1건</w:t>
+            </w:r>
+          </w:p>
+        </w:tc>
+        <w:tc>
+          <w:tcPr>
+            <w:tcW w:type="dxa" w:w="2098"/>
+            <w:tcMar>
+              <w:top w:w="100" w:type="dxa"/>
+              <w:start w:w="120" w:type="dxa"/>
+              <w:bottom w:w="100" w:type="dxa"/>
+              <w:end w:w="120" w:type="dxa"/>
+            </w:tcMar>
+            <w:vAlign w:val="center"/>
+          </w:tcPr>
+          <w:p>
+            <w:r>
+              <w:rPr>
+                <w:rFonts w:ascii="AppleGothic" w:hAnsi="AppleGothic" w:eastAsia="AppleGothic"/>
+                <w:sz w:val="16"/>
+              </w:rPr>
+              <w:t>0/1건</w:t>
+            </w:r>
+          </w:p>
+        </w:tc>
+      </w:tr>
+      <w:tr>
+        <w:tc>
+          <w:tcPr>
+            <w:tcW w:type="dxa" w:w="3061"/>
+            <w:tcMar>
+              <w:top w:w="100" w:type="dxa"/>
+              <w:start w:w="120" w:type="dxa"/>
+              <w:bottom w:w="100" w:type="dxa"/>
+              <w:end w:w="120" w:type="dxa"/>
+            </w:tcMar>
+            <w:vAlign w:val="center"/>
+            <w:shd w:fill="F7F9FC"/>
+          </w:tcPr>
+          <w:p>
+            <w:r>
+              <w:rPr>
+                <w:rFonts w:ascii="AppleGothic" w:hAnsi="AppleGothic" w:eastAsia="AppleGothic"/>
+                <w:sz w:val="16"/>
+              </w:rPr>
+              <w:t>반복 문장 또는 같은 마지막 안내</w:t>
+            </w:r>
+          </w:p>
+        </w:tc>
+        <w:tc>
+          <w:tcPr>
+            <w:tcW w:type="dxa" w:w="2098"/>
+            <w:tcMar>
+              <w:top w:w="100" w:type="dxa"/>
+              <w:start w:w="120" w:type="dxa"/>
+              <w:bottom w:w="100" w:type="dxa"/>
+              <w:end w:w="120" w:type="dxa"/>
+            </w:tcMar>
+            <w:vAlign w:val="center"/>
+            <w:shd w:fill="F7F9FC"/>
+          </w:tcPr>
+          <w:p>
+            <w:r>
+              <w:rPr>
+                <w:rFonts w:ascii="AppleGothic" w:hAnsi="AppleGothic" w:eastAsia="AppleGothic"/>
+                <w:sz w:val="16"/>
+              </w:rPr>
+              <w:t>3/4건</w:t>
+            </w:r>
+          </w:p>
+        </w:tc>
+        <w:tc>
+          <w:tcPr>
+            <w:tcW w:type="dxa" w:w="2098"/>
+            <w:tcMar>
+              <w:top w:w="100" w:type="dxa"/>
+              <w:start w:w="120" w:type="dxa"/>
+              <w:bottom w:w="100" w:type="dxa"/>
+              <w:end w:w="120" w:type="dxa"/>
+            </w:tcMar>
+            <w:vAlign w:val="center"/>
+            <w:shd w:fill="F7F9FC"/>
+          </w:tcPr>
+          <w:p>
+            <w:r>
+              <w:rPr>
+                <w:rFonts w:ascii="AppleGothic" w:hAnsi="AppleGothic" w:eastAsia="AppleGothic"/>
+                <w:sz w:val="16"/>
+              </w:rPr>
+              <w:t>0/4건</w:t>
+            </w:r>
+          </w:p>
+        </w:tc>
+        <w:tc>
+          <w:tcPr>
+            <w:tcW w:type="dxa" w:w="2098"/>
+            <w:tcMar>
+              <w:top w:w="100" w:type="dxa"/>
+              <w:start w:w="120" w:type="dxa"/>
+              <w:bottom w:w="100" w:type="dxa"/>
+              <w:end w:w="120" w:type="dxa"/>
+            </w:tcMar>
+            <w:vAlign w:val="center"/>
+            <w:shd w:fill="F7F9FC"/>
+          </w:tcPr>
+          <w:p>
+            <w:r>
+              <w:rPr>
+                <w:rFonts w:ascii="AppleGothic" w:hAnsi="AppleGothic" w:eastAsia="AppleGothic"/>
+                <w:sz w:val="16"/>
+              </w:rPr>
+              <w:t>0/4건</w:t>
+            </w:r>
+          </w:p>
+        </w:tc>
+      </w:tr>
+      <w:tr>
+        <w:tc>
+          <w:tcPr>
+            <w:tcW w:type="dxa" w:w="3061"/>
+            <w:tcMar>
+              <w:top w:w="100" w:type="dxa"/>
+              <w:start w:w="120" w:type="dxa"/>
+              <w:bottom w:w="100" w:type="dxa"/>
+              <w:end w:w="120" w:type="dxa"/>
+            </w:tcMar>
+            <w:vAlign w:val="center"/>
+          </w:tcPr>
+          <w:p>
+            <w:r>
+              <w:rPr>
+                <w:rFonts w:ascii="AppleGothic" w:hAnsi="AppleGothic" w:eastAsia="AppleGothic"/>
+                <w:sz w:val="16"/>
+              </w:rPr>
+              <w:t>입력 없음 언급('제공되지 않았습니다')</w:t>
+            </w:r>
+          </w:p>
+        </w:tc>
+        <w:tc>
+          <w:tcPr>
+            <w:tcW w:type="dxa" w:w="2098"/>
+            <w:tcMar>
+              <w:top w:w="100" w:type="dxa"/>
+              <w:start w:w="120" w:type="dxa"/>
+              <w:bottom w:w="100" w:type="dxa"/>
+              <w:end w:w="120" w:type="dxa"/>
+            </w:tcMar>
+            <w:vAlign w:val="center"/>
+          </w:tcPr>
+          <w:p>
+            <w:r>
+              <w:rPr>
+                <w:rFonts w:ascii="AppleGothic" w:hAnsi="AppleGothic" w:eastAsia="AppleGothic"/>
+                <w:sz w:val="16"/>
+              </w:rPr>
+              <w:t>0/4건</w:t>
+            </w:r>
+          </w:p>
+        </w:tc>
+        <w:tc>
+          <w:tcPr>
+            <w:tcW w:type="dxa" w:w="2098"/>
+            <w:tcMar>
+              <w:top w:w="100" w:type="dxa"/>
+              <w:start w:w="120" w:type="dxa"/>
+              <w:bottom w:w="100" w:type="dxa"/>
+              <w:end w:w="120" w:type="dxa"/>
+            </w:tcMar>
+            <w:vAlign w:val="center"/>
+          </w:tcPr>
+          <w:p>
+            <w:r>
+              <w:rPr>
+                <w:rFonts w:ascii="AppleGothic" w:hAnsi="AppleGothic" w:eastAsia="AppleGothic"/>
+                <w:sz w:val="16"/>
+              </w:rPr>
+              <w:t>1/4건</w:t>
+            </w:r>
+          </w:p>
+        </w:tc>
+        <w:tc>
+          <w:tcPr>
+            <w:tcW w:type="dxa" w:w="2098"/>
+            <w:tcMar>
+              <w:top w:w="100" w:type="dxa"/>
+              <w:start w:w="120" w:type="dxa"/>
+              <w:bottom w:w="100" w:type="dxa"/>
+              <w:end w:w="120" w:type="dxa"/>
+            </w:tcMar>
+            <w:vAlign w:val="center"/>
+          </w:tcPr>
+          <w:p>
+            <w:r>
+              <w:rPr>
+                <w:rFonts w:ascii="AppleGothic" w:hAnsi="AppleGothic" w:eastAsia="AppleGothic"/>
+                <w:sz w:val="16"/>
+              </w:rPr>
+              <w:t>0/4건</w:t>
+            </w:r>
+          </w:p>
+        </w:tc>
+      </w:tr>
+      <w:tr>
+        <w:tc>
+          <w:tcPr>
+            <w:tcW w:type="dxa" w:w="3061"/>
+            <w:tcMar>
+              <w:top w:w="100" w:type="dxa"/>
+              <w:start w:w="120" w:type="dxa"/>
+              <w:bottom w:w="100" w:type="dxa"/>
+              <w:end w:w="120" w:type="dxa"/>
+            </w:tcMar>
+            <w:vAlign w:val="center"/>
+            <w:shd w:fill="F7F9FC"/>
+          </w:tcPr>
+          <w:p>
+            <w:r>
+              <w:rPr>
+                <w:rFonts w:ascii="AppleGothic" w:hAnsi="AppleGothic" w:eastAsia="AppleGothic"/>
+                <w:sz w:val="16"/>
+              </w:rPr>
+              <w:t>'정가' 표기·입력에 없는 착용 효과 후보</w:t>
+            </w:r>
+          </w:p>
+        </w:tc>
+        <w:tc>
+          <w:tcPr>
+            <w:tcW w:type="dxa" w:w="2098"/>
+            <w:tcMar>
+              <w:top w:w="100" w:type="dxa"/>
+              <w:start w:w="120" w:type="dxa"/>
+              <w:bottom w:w="100" w:type="dxa"/>
+              <w:end w:w="120" w:type="dxa"/>
+            </w:tcMar>
+            <w:vAlign w:val="center"/>
+            <w:shd w:fill="F7F9FC"/>
+          </w:tcPr>
+          <w:p>
+            <w:r>
+              <w:rPr>
+                <w:rFonts w:ascii="AppleGothic" w:hAnsi="AppleGothic" w:eastAsia="AppleGothic"/>
+                <w:sz w:val="16"/>
+              </w:rPr>
+              <w:t>0/4건</w:t>
+            </w:r>
+          </w:p>
+        </w:tc>
+        <w:tc>
+          <w:tcPr>
+            <w:tcW w:type="dxa" w:w="2098"/>
+            <w:tcMar>
+              <w:top w:w="100" w:type="dxa"/>
+              <w:start w:w="120" w:type="dxa"/>
+              <w:bottom w:w="100" w:type="dxa"/>
+              <w:end w:w="120" w:type="dxa"/>
+            </w:tcMar>
+            <w:vAlign w:val="center"/>
+            <w:shd w:fill="F7F9FC"/>
+          </w:tcPr>
+          <w:p>
+            <w:r>
+              <w:rPr>
+                <w:rFonts w:ascii="AppleGothic" w:hAnsi="AppleGothic" w:eastAsia="AppleGothic"/>
+                <w:sz w:val="16"/>
+              </w:rPr>
+              <w:t>4/4건</w:t>
+            </w:r>
+          </w:p>
+        </w:tc>
+        <w:tc>
+          <w:tcPr>
+            <w:tcW w:type="dxa" w:w="2098"/>
+            <w:tcMar>
+              <w:top w:w="100" w:type="dxa"/>
+              <w:start w:w="120" w:type="dxa"/>
+              <w:bottom w:w="100" w:type="dxa"/>
+              <w:end w:w="120" w:type="dxa"/>
+            </w:tcMar>
+            <w:vAlign w:val="center"/>
+            <w:shd w:fill="F7F9FC"/>
+          </w:tcPr>
+          <w:p>
+            <w:r>
+              <w:rPr>
+                <w:rFonts w:ascii="AppleGothic" w:hAnsi="AppleGothic" w:eastAsia="AppleGothic"/>
+                <w:sz w:val="16"/>
+              </w:rPr>
+              <w:t>1/4건</w:t>
+            </w:r>
+          </w:p>
+        </w:tc>
+      </w:tr>
+      <w:tr>
+        <w:tc>
+          <w:tcPr>
+            <w:tcW w:type="dxa" w:w="3061"/>
+            <w:tcMar>
+              <w:top w:w="100" w:type="dxa"/>
+              <w:start w:w="120" w:type="dxa"/>
+              <w:bottom w:w="100" w:type="dxa"/>
+              <w:end w:w="120" w:type="dxa"/>
+            </w:tcMar>
+            <w:vAlign w:val="center"/>
+          </w:tcPr>
+          <w:p>
+            <w:r>
+              <w:rPr>
+                <w:rFonts w:ascii="AppleGothic" w:hAnsi="AppleGothic" w:eastAsia="AppleGothic"/>
+                <w:sz w:val="16"/>
+              </w:rPr>
+              <w:t>평가어('깔끔한'·'기본 아이템' 등)가 든 초안</w:t>
+            </w:r>
+          </w:p>
+        </w:tc>
+        <w:tc>
+          <w:tcPr>
+            <w:tcW w:type="dxa" w:w="2098"/>
+            <w:tcMar>
+              <w:top w:w="100" w:type="dxa"/>
+              <w:start w:w="120" w:type="dxa"/>
+              <w:bottom w:w="100" w:type="dxa"/>
+              <w:end w:w="120" w:type="dxa"/>
+            </w:tcMar>
+            <w:vAlign w:val="center"/>
+          </w:tcPr>
+          <w:p>
+            <w:r>
+              <w:rPr>
+                <w:rFonts w:ascii="AppleGothic" w:hAnsi="AppleGothic" w:eastAsia="AppleGothic"/>
+                <w:sz w:val="16"/>
+              </w:rPr>
+              <w:t>1/12개</w:t>
+            </w:r>
+          </w:p>
+        </w:tc>
+        <w:tc>
+          <w:tcPr>
+            <w:tcW w:type="dxa" w:w="2098"/>
+            <w:tcMar>
+              <w:top w:w="100" w:type="dxa"/>
+              <w:start w:w="120" w:type="dxa"/>
+              <w:bottom w:w="100" w:type="dxa"/>
+              <w:end w:w="120" w:type="dxa"/>
+            </w:tcMar>
+            <w:vAlign w:val="center"/>
+          </w:tcPr>
+          <w:p>
+            <w:r>
+              <w:rPr>
+                <w:rFonts w:ascii="AppleGothic" w:hAnsi="AppleGothic" w:eastAsia="AppleGothic"/>
+                <w:sz w:val="16"/>
+              </w:rPr>
+              <w:t>9/12개</w:t>
+            </w:r>
+          </w:p>
+        </w:tc>
+        <w:tc>
+          <w:tcPr>
+            <w:tcW w:type="dxa" w:w="2098"/>
+            <w:tcMar>
+              <w:top w:w="100" w:type="dxa"/>
+              <w:start w:w="120" w:type="dxa"/>
+              <w:bottom w:w="100" w:type="dxa"/>
+              <w:end w:w="120" w:type="dxa"/>
+            </w:tcMar>
+            <w:vAlign w:val="center"/>
+          </w:tcPr>
+          <w:p>
+            <w:r>
+              <w:rPr>
+                <w:rFonts w:ascii="AppleGothic" w:hAnsi="AppleGothic" w:eastAsia="AppleGothic"/>
+                <w:sz w:val="16"/>
+              </w:rPr>
+              <w:t>9/12개</w:t>
+            </w:r>
+          </w:p>
+        </w:tc>
+      </w:tr>
+    </w:tbl>
+    <w:p>
+      <w:pPr>
+        <w:spacing w:after="0"/>
+      </w:pPr>
+    </w:p>
+    <w:p>
+      <w:r>
+        <w:rPr>
+          <w:rFonts w:ascii="AppleGothic" w:hAnsi="AppleGothic" w:eastAsia="AppleGothic"/>
+        </w:rPr>
+        <w:t>2차는 형식 문제를 없앴지만 판매가 26,100원을 '정가'라고 쓰거나 '하루 종일 편하게'처럼 입력에 없는 착용 효과를 단정하는 문장이 새로 생겼다. 3차에서 판매가가 이미 할인이 반영된 금액임을 명시하고 착용 효과와 '정보가 제공되지 않았다'는 문장을 금지해 이런 후보를 4건에서 1건(볼캡의 '부담 없이')으로 줄였다. 다만 평가어가 든 초안이 1/12개에서 9/12개로 늘어, 판매자가 사실 여부를 검토해야 하는 표현이 많아졌다. 평가어 집계는 키워드 개수 기준의 대략적인 지표다.</w:t>
+      </w:r>
+    </w:p>
+    <w:p>
+      <w:r>
+        <w:rPr>
+          <w:rFonts w:ascii="AppleGothic" w:hAnsi="AppleGothic" w:eastAsia="AppleGothic"/>
+        </w:rPr>
+        <w:t>비교에는 다음 한계가 있다. (1) 2·3차는 추론 강도를 낮췄고(1차는 기본값) 응답 시간 차이에는 이 설정이 포함된다. 재실행 12회 중 2회가 30초·45초 제한에서 시간 초과됐고 원인은 확인하지 못했다. (2) 볼캡·할인 홍보 입력의 추가 요청이 말투와 충돌해 2·3차에서 바꿨으므로 두 입력은 1차와 조건이 다르다. (3) 개선 항목을 같은 4개 입력을 읽고 정했기 때문에 이 결과는 독립된 검증이 아니다. (4) 수치는 자동 검사와 Claude Code의 읽기 검토이며 사람 평가가 아니다. 사람 최종 평가는 아직 없다.</w:t>
       </w:r>
     </w:p>
     <w:p>
@@ -3733,7 +4496,7 @@
                 <w:rFonts w:ascii="AppleGothic" w:hAnsi="AppleGothic" w:eastAsia="AppleGothic"/>
                 <w:sz w:val="16"/>
               </w:rPr>
-              <w:t>106개 자동 검사와 타입·린트·빌드 기록</w:t>
+              <w:t>108개 자동 검사와 타입·린트·빌드 기록</w:t>
             </w:r>
           </w:p>
         </w:tc>

</xml_diff>

<commit_message>
docs: apply humanizer-derived writing rules to the report and repository docs
Rewrites prose in the report (PDF, DOCX, draft), README, plan, spec, tools,
validation, timeline, evaluation guide and the 9/29-9/30 journals: removes
bold labels, arrows, meta-narration and duplicated sentences, and updates
stale status lines. Facts, numbers and AI-tool disclosures are unchanged.
Adds the summary of all prompt versions (scripts/summarize-ad-runs.ts and
the repeat runs), prompt 2026-09-30.3 to .5 and 112 tests.

Co-Authored-By: Claude Sonnet 5.5 <noreply@anthropic.com>
</commit_message>
<xml_diff>
--- a/docs/report/FITROOM_PROJECT_REPORT.docx
+++ b/docs/report/FITROOM_PROJECT_REPORT.docx
@@ -135,7 +135,7 @@
                 <w:rFonts w:ascii="AppleGothic" w:hAnsi="AppleGothic" w:eastAsia="AppleGothic"/>
                 <w:sz w:val="17"/>
               </w:rPr>
-              <w:t>2026년 9월 29일</w:t>
+              <w:t>2026년 9월 30일</w:t>
             </w:r>
           </w:p>
         </w:tc>
@@ -370,7 +370,7 @@
                 <w:rFonts w:ascii="AppleGothic" w:hAnsi="AppleGothic" w:eastAsia="AppleGothic"/>
                 <w:sz w:val="16"/>
               </w:rPr>
-              <w:t>108개 통과</w:t>
+              <w:t>112개 통과</w:t>
             </w:r>
           </w:p>
         </w:tc>
@@ -550,7 +550,7 @@
                 <w:rFonts w:ascii="AppleGothic" w:hAnsi="AppleGothic" w:eastAsia="AppleGothic"/>
                 <w:sz w:val="16"/>
               </w:rPr>
-              <w:t>정상 4건 통과 · 평균 19.1초 · 사실 보존 5.00/5</w:t>
+              <w:t>개정판 12건 생성 성공 · 평균 7.2초 · 사람 평가 대기</w:t>
             </w:r>
           </w:p>
         </w:tc>
@@ -877,7 +877,7 @@
                 <w:rFonts w:ascii="AppleGothic" w:hAnsi="AppleGothic" w:eastAsia="AppleGothic"/>
                 <w:sz w:val="16"/>
               </w:rPr>
-              <w:t>상품 정보 → 광고 조건 → 초안 3개 → 검토·편집 → 저장</w:t>
+              <w:t>상품 정보, 광고 조건, 초안 3개, 검토·편집, 저장 순서</w:t>
             </w:r>
           </w:p>
         </w:tc>
@@ -2057,7 +2057,7 @@
           <w:rFonts w:ascii="AppleGothic" w:hAnsi="AppleGothic" w:eastAsia="AppleGothic"/>
           <w:sz w:val="18"/>
         </w:rPr>
-        <w:t>비어 있는 선택값은 빈 문자열이나 0 대신 null로 정규화한다.</w:t>
+        <w:t>비어 있는 선택값은 빈 문자열이나 0 대신 null로 정규화하고, 모델 요청에서는 뺀다.</w:t>
       </w:r>
     </w:p>
     <w:p>
@@ -2157,6 +2157,45 @@
           <w:sz w:val="18"/>
         </w:rPr>
         <w:t>상품 특징·스타일링·일상 장면의 세 관점과 중복되지 않는 제목을 만든다.</w:t>
+      </w:r>
+    </w:p>
+    <w:p>
+      <w:pPr>
+        <w:pStyle w:val="ListBullet"/>
+        <w:spacing w:after="40"/>
+      </w:pPr>
+      <w:r>
+        <w:rPr>
+          <w:rFonts w:ascii="AppleGothic" w:hAnsi="AppleGothic" w:eastAsia="AppleGothic"/>
+          <w:sz w:val="18"/>
+        </w:rPr>
+        <w:t>판매가는 이미 할인이 반영된 금액으로 다루고 정가를 만들지 않는다.</w:t>
+      </w:r>
+    </w:p>
+    <w:p>
+      <w:pPr>
+        <w:pStyle w:val="ListBullet"/>
+        <w:spacing w:after="40"/>
+      </w:pPr>
+      <w:r>
+        <w:rPr>
+          <w:rFonts w:ascii="AppleGothic" w:hAnsi="AppleGothic" w:eastAsia="AppleGothic"/>
+          <w:sz w:val="18"/>
+        </w:rPr>
+        <w:t>입력에 없는 착용 효과와 소재를 이유로 한 효과를 쓰지 않는다.</w:t>
+      </w:r>
+    </w:p>
+    <w:p>
+      <w:pPr>
+        <w:pStyle w:val="ListBullet"/>
+        <w:spacing w:after="40"/>
+      </w:pPr>
+      <w:r>
+        <w:rPr>
+          <w:rFonts w:ascii="AppleGothic" w:hAnsi="AppleGothic" w:eastAsia="AppleGothic"/>
+          <w:sz w:val="18"/>
+        </w:rPr>
+        <w:t>AI 문투(대조 구조, 구호·격언, 과장·평가어, 억지 삼단 구성, 같은 시작, 군말)를 피한다.</w:t>
       </w:r>
     </w:p>
     <w:p>
@@ -2603,7 +2642,7 @@
                 <w:rFonts w:ascii="AppleGothic" w:hAnsi="AppleGothic" w:eastAsia="AppleGothic"/>
                 <w:sz w:val="16"/>
               </w:rPr>
-              <w:t>29</w:t>
+              <w:t>33</w:t>
             </w:r>
           </w:p>
         </w:tc>
@@ -2736,7 +2775,7 @@
                 <w:rFonts w:ascii="AppleGothic" w:hAnsi="AppleGothic" w:eastAsia="AppleGothic"/>
                 <w:sz w:val="16"/>
               </w:rPr>
-              <w:t>108</w:t>
+              <w:t>112</w:t>
             </w:r>
           </w:p>
         </w:tc>
@@ -2792,7 +2831,7 @@
           <w:rFonts w:ascii="AppleGothic" w:hAnsi="AppleGothic" w:eastAsia="AppleGothic"/>
           <w:sz w:val="18"/>
         </w:rPr>
-        <w:t>판매자 저장 → D1 계정 저장 → 공개 카탈로그 → 이용자 상점 거리 → 진열 매장 입장 확인</w:t>
+        <w:t>판매자 저장, D1 계정 저장, 공개 카탈로그, 이용자 상점 거리, 진열 매장 입장까지 확인</w:t>
       </w:r>
     </w:p>
     <w:p>
@@ -3333,7 +3372,7 @@
         <w:rPr>
           <w:rFonts w:ascii="AppleGothic" w:hAnsi="AppleGothic" w:eastAsia="AppleGothic"/>
         </w:rPr>
-        <w:t>상단 표의 수치는 프롬프트 2026-09-16.1(1차) 기준이다. 12개 초안을 다시 읽어 판매자 요청 문장의 본문 인용, 신상 표현 누락, 초안 간 반복 문장·같은 마지막 안내, 항목 나열식 문장을 확인했고, 말투·목적·마지막 안내 값별 기준을 넣어 프롬프트를 두 번 고친 뒤 같은 4개 입력을 다시 생성했다. 자동 검사에도 같은 항목을 찾는 검사를 추가했다.</w:t>
+        <w:t>상단 표의 수치는 프롬프트 2026-09-16.1(1차) 기준이다. 12개 초안을 다시 읽어 판매자 요청 문장의 본문 인용, 신상 표현 누락, 초안 간 반복 문장·같은 마지막 안내, 항목 나열식 문장을 확인했고, 자동 검사에도 같은 항목을 찾는 검사를 추가했다. 이후 프롬프트를 다섯 번 고치며(2026-09-30.1~.5) 같은 4개 입력을 다시 생성했다. 2026-09-30.2 이후 판은 각각 3회(12건)씩 반복해 버전별로 집계했다. 아래 표는 첫 판, 중간 판(.2), 최종 판(.5)만 발췌했고 여섯 판 전체는 저장소의 평가 안내 문서에 있다.</w:t>
       </w:r>
     </w:p>
     <w:tbl>
@@ -3356,7 +3395,7 @@
         </w:trPr>
         <w:tc>
           <w:tcPr>
-            <w:tcW w:type="dxa" w:w="3061"/>
+            <w:tcW w:type="dxa" w:w="2948"/>
             <w:shd w:fill="121826"/>
             <w:tcMar>
               <w:top w:w="100" w:type="dxa"/>
@@ -3404,7 +3443,7 @@
                 <w:color w:val="FFFFFF"/>
                 <w:sz w:val="16"/>
               </w:rPr>
-              <w:t>1차 (09-16.1)</w:t>
+              <w:t>1차 (09-16.1, 4건)</w:t>
             </w:r>
           </w:p>
         </w:tc>
@@ -3431,13 +3470,13 @@
                 <w:color w:val="FFFFFF"/>
                 <w:sz w:val="16"/>
               </w:rPr>
-              <w:t>2차 (09-30.1)</w:t>
+              <w:t>09-30.2 (3회 12건)</w:t>
             </w:r>
           </w:p>
         </w:tc>
         <w:tc>
           <w:tcPr>
-            <w:tcW w:type="dxa" w:w="2098"/>
+            <w:tcW w:type="dxa" w:w="2211"/>
             <w:shd w:fill="121826"/>
             <w:tcMar>
               <w:top w:w="100" w:type="dxa"/>
@@ -3458,7 +3497,7 @@
                 <w:color w:val="FFFFFF"/>
                 <w:sz w:val="16"/>
               </w:rPr>
-              <w:t>3차 (09-30.2)</w:t>
+              <w:t>09-30.5 최종 (3회 12건)</w:t>
             </w:r>
           </w:p>
         </w:tc>
@@ -3466,7 +3505,7 @@
       <w:tr>
         <w:tc>
           <w:tcPr>
-            <w:tcW w:type="dxa" w:w="3061"/>
+            <w:tcW w:type="dxa" w:w="2948"/>
             <w:tcMar>
               <w:top w:w="100" w:type="dxa"/>
               <w:start w:w="120" w:type="dxa"/>
@@ -3481,7 +3520,7 @@
                 <w:rFonts w:ascii="AppleGothic" w:hAnsi="AppleGothic" w:eastAsia="AppleGothic"/>
                 <w:sz w:val="16"/>
               </w:rPr>
-              <w:t>평균 응답 시간(범위)</w:t>
+              <w:t>평균 응답 시간</w:t>
             </w:r>
           </w:p>
         </w:tc>
@@ -3502,7 +3541,7 @@
                 <w:rFonts w:ascii="AppleGothic" w:hAnsi="AppleGothic" w:eastAsia="AppleGothic"/>
                 <w:sz w:val="16"/>
               </w:rPr>
-              <w:t>19.1초 (14.8–22.5)</w:t>
+              <w:t>19.1초</w:t>
             </w:r>
           </w:p>
         </w:tc>
@@ -3523,13 +3562,13 @@
                 <w:rFonts w:ascii="AppleGothic" w:hAnsi="AppleGothic" w:eastAsia="AppleGothic"/>
                 <w:sz w:val="16"/>
               </w:rPr>
-              <w:t>6.6초 (5.7–7.6)</w:t>
+              <w:t>6.3초</w:t>
             </w:r>
           </w:p>
         </w:tc>
         <w:tc>
           <w:tcPr>
-            <w:tcW w:type="dxa" w:w="2098"/>
+            <w:tcW w:type="dxa" w:w="2211"/>
             <w:tcMar>
               <w:top w:w="100" w:type="dxa"/>
               <w:start w:w="120" w:type="dxa"/>
@@ -3544,7 +3583,7 @@
                 <w:rFonts w:ascii="AppleGothic" w:hAnsi="AppleGothic" w:eastAsia="AppleGothic"/>
                 <w:sz w:val="16"/>
               </w:rPr>
-              <w:t>6.7초 (5.3–8.1)</w:t>
+              <w:t>7.2초</w:t>
             </w:r>
           </w:p>
         </w:tc>
@@ -3552,7 +3591,7 @@
       <w:tr>
         <w:tc>
           <w:tcPr>
-            <w:tcW w:type="dxa" w:w="3061"/>
+            <w:tcW w:type="dxa" w:w="2948"/>
             <w:tcMar>
               <w:top w:w="100" w:type="dxa"/>
               <w:start w:w="120" w:type="dxa"/>
@@ -3612,13 +3651,13 @@
                 <w:rFonts w:ascii="AppleGothic" w:hAnsi="AppleGothic" w:eastAsia="AppleGothic"/>
                 <w:sz w:val="16"/>
               </w:rPr>
-              <w:t>0/4건</w:t>
+              <w:t>1/12건</w:t>
             </w:r>
           </w:p>
         </w:tc>
         <w:tc>
           <w:tcPr>
-            <w:tcW w:type="dxa" w:w="2098"/>
+            <w:tcW w:type="dxa" w:w="2211"/>
             <w:tcMar>
               <w:top w:w="100" w:type="dxa"/>
               <w:start w:w="120" w:type="dxa"/>
@@ -3634,7 +3673,7 @@
                 <w:rFonts w:ascii="AppleGothic" w:hAnsi="AppleGothic" w:eastAsia="AppleGothic"/>
                 <w:sz w:val="16"/>
               </w:rPr>
-              <w:t>0/4건</w:t>
+              <w:t>0/12건</w:t>
             </w:r>
           </w:p>
         </w:tc>
@@ -3642,7 +3681,7 @@
       <w:tr>
         <w:tc>
           <w:tcPr>
-            <w:tcW w:type="dxa" w:w="3061"/>
+            <w:tcW w:type="dxa" w:w="2948"/>
             <w:tcMar>
               <w:top w:w="100" w:type="dxa"/>
               <w:start w:w="120" w:type="dxa"/>
@@ -3657,7 +3696,7 @@
                 <w:rFonts w:ascii="AppleGothic" w:hAnsi="AppleGothic" w:eastAsia="AppleGothic"/>
                 <w:sz w:val="16"/>
               </w:rPr>
-              <w:t>신상 표현 누락(신상 입력 1건)</w:t>
+              <w:t>신상·할인 목적 표현 누락</w:t>
             </w:r>
           </w:p>
         </w:tc>
@@ -3678,7 +3717,7 @@
                 <w:rFonts w:ascii="AppleGothic" w:hAnsi="AppleGothic" w:eastAsia="AppleGothic"/>
                 <w:sz w:val="16"/>
               </w:rPr>
-              <w:t>1/1건</w:t>
+              <w:t>1/4건</w:t>
             </w:r>
           </w:p>
         </w:tc>
@@ -3699,13 +3738,13 @@
                 <w:rFonts w:ascii="AppleGothic" w:hAnsi="AppleGothic" w:eastAsia="AppleGothic"/>
                 <w:sz w:val="16"/>
               </w:rPr>
-              <w:t>0/1건</w:t>
+              <w:t>0/12건</w:t>
             </w:r>
           </w:p>
         </w:tc>
         <w:tc>
           <w:tcPr>
-            <w:tcW w:type="dxa" w:w="2098"/>
+            <w:tcW w:type="dxa" w:w="2211"/>
             <w:tcMar>
               <w:top w:w="100" w:type="dxa"/>
               <w:start w:w="120" w:type="dxa"/>
@@ -3720,7 +3759,7 @@
                 <w:rFonts w:ascii="AppleGothic" w:hAnsi="AppleGothic" w:eastAsia="AppleGothic"/>
                 <w:sz w:val="16"/>
               </w:rPr>
-              <w:t>0/1건</w:t>
+              <w:t>0/12건</w:t>
             </w:r>
           </w:p>
         </w:tc>
@@ -3728,7 +3767,7 @@
       <w:tr>
         <w:tc>
           <w:tcPr>
-            <w:tcW w:type="dxa" w:w="3061"/>
+            <w:tcW w:type="dxa" w:w="2948"/>
             <w:tcMar>
               <w:top w:w="100" w:type="dxa"/>
               <w:start w:w="120" w:type="dxa"/>
@@ -3744,7 +3783,7 @@
                 <w:rFonts w:ascii="AppleGothic" w:hAnsi="AppleGothic" w:eastAsia="AppleGothic"/>
                 <w:sz w:val="16"/>
               </w:rPr>
-              <w:t>반복 문장 또는 같은 마지막 안내</w:t>
+              <w:t>반복 문장·같은 마지막 안내</w:t>
             </w:r>
           </w:p>
         </w:tc>
@@ -3788,13 +3827,13 @@
                 <w:rFonts w:ascii="AppleGothic" w:hAnsi="AppleGothic" w:eastAsia="AppleGothic"/>
                 <w:sz w:val="16"/>
               </w:rPr>
-              <w:t>0/4건</w:t>
+              <w:t>0/12건</w:t>
             </w:r>
           </w:p>
         </w:tc>
         <w:tc>
           <w:tcPr>
-            <w:tcW w:type="dxa" w:w="2098"/>
+            <w:tcW w:type="dxa" w:w="2211"/>
             <w:tcMar>
               <w:top w:w="100" w:type="dxa"/>
               <w:start w:w="120" w:type="dxa"/>
@@ -3810,7 +3849,7 @@
                 <w:rFonts w:ascii="AppleGothic" w:hAnsi="AppleGothic" w:eastAsia="AppleGothic"/>
                 <w:sz w:val="16"/>
               </w:rPr>
-              <w:t>0/4건</w:t>
+              <w:t>0/12건</w:t>
             </w:r>
           </w:p>
         </w:tc>
@@ -3818,7 +3857,7 @@
       <w:tr>
         <w:tc>
           <w:tcPr>
-            <w:tcW w:type="dxa" w:w="3061"/>
+            <w:tcW w:type="dxa" w:w="2948"/>
             <w:tcMar>
               <w:top w:w="100" w:type="dxa"/>
               <w:start w:w="120" w:type="dxa"/>
@@ -3875,13 +3914,13 @@
                 <w:rFonts w:ascii="AppleGothic" w:hAnsi="AppleGothic" w:eastAsia="AppleGothic"/>
                 <w:sz w:val="16"/>
               </w:rPr>
-              <w:t>1/4건</w:t>
+              <w:t>0/12건</w:t>
             </w:r>
           </w:p>
         </w:tc>
         <w:tc>
           <w:tcPr>
-            <w:tcW w:type="dxa" w:w="2098"/>
+            <w:tcW w:type="dxa" w:w="2211"/>
             <w:tcMar>
               <w:top w:w="100" w:type="dxa"/>
               <w:start w:w="120" w:type="dxa"/>
@@ -3896,7 +3935,7 @@
                 <w:rFonts w:ascii="AppleGothic" w:hAnsi="AppleGothic" w:eastAsia="AppleGothic"/>
                 <w:sz w:val="16"/>
               </w:rPr>
-              <w:t>0/4건</w:t>
+              <w:t>0/12건</w:t>
             </w:r>
           </w:p>
         </w:tc>
@@ -3904,7 +3943,7 @@
       <w:tr>
         <w:tc>
           <w:tcPr>
-            <w:tcW w:type="dxa" w:w="3061"/>
+            <w:tcW w:type="dxa" w:w="2948"/>
             <w:tcMar>
               <w:top w:w="100" w:type="dxa"/>
               <w:start w:w="120" w:type="dxa"/>
@@ -3920,7 +3959,7 @@
                 <w:rFonts w:ascii="AppleGothic" w:hAnsi="AppleGothic" w:eastAsia="AppleGothic"/>
                 <w:sz w:val="16"/>
               </w:rPr>
-              <w:t>'정가' 표기·입력에 없는 착용 효과 후보</w:t>
+              <w:t>'정가' 표기·착용 효과 의심 표현</w:t>
             </w:r>
           </w:p>
         </w:tc>
@@ -3964,7 +4003,139 @@
                 <w:rFonts w:ascii="AppleGothic" w:hAnsi="AppleGothic" w:eastAsia="AppleGothic"/>
                 <w:sz w:val="16"/>
               </w:rPr>
-              <w:t>4/4건</w:t>
+              <w:t>4/12건</w:t>
+            </w:r>
+          </w:p>
+        </w:tc>
+        <w:tc>
+          <w:tcPr>
+            <w:tcW w:type="dxa" w:w="2211"/>
+            <w:tcMar>
+              <w:top w:w="100" w:type="dxa"/>
+              <w:start w:w="120" w:type="dxa"/>
+              <w:bottom w:w="100" w:type="dxa"/>
+              <w:end w:w="120" w:type="dxa"/>
+            </w:tcMar>
+            <w:vAlign w:val="center"/>
+            <w:shd w:fill="F7F9FC"/>
+          </w:tcPr>
+          <w:p>
+            <w:r>
+              <w:rPr>
+                <w:rFonts w:ascii="AppleGothic" w:hAnsi="AppleGothic" w:eastAsia="AppleGothic"/>
+                <w:sz w:val="16"/>
+              </w:rPr>
+              <w:t>2/12건</w:t>
+            </w:r>
+          </w:p>
+        </w:tc>
+      </w:tr>
+      <w:tr>
+        <w:tc>
+          <w:tcPr>
+            <w:tcW w:type="dxa" w:w="2948"/>
+            <w:tcMar>
+              <w:top w:w="100" w:type="dxa"/>
+              <w:start w:w="120" w:type="dxa"/>
+              <w:bottom w:w="100" w:type="dxa"/>
+              <w:end w:w="120" w:type="dxa"/>
+            </w:tcMar>
+            <w:vAlign w:val="center"/>
+          </w:tcPr>
+          <w:p>
+            <w:r>
+              <w:rPr>
+                <w:rFonts w:ascii="AppleGothic" w:hAnsi="AppleGothic" w:eastAsia="AppleGothic"/>
+                <w:sz w:val="16"/>
+              </w:rPr>
+              <w:t>소재를 이유로 한 효과('면 100%라 ~')</w:t>
+            </w:r>
+          </w:p>
+        </w:tc>
+        <w:tc>
+          <w:tcPr>
+            <w:tcW w:type="dxa" w:w="2098"/>
+            <w:tcMar>
+              <w:top w:w="100" w:type="dxa"/>
+              <w:start w:w="120" w:type="dxa"/>
+              <w:bottom w:w="100" w:type="dxa"/>
+              <w:end w:w="120" w:type="dxa"/>
+            </w:tcMar>
+            <w:vAlign w:val="center"/>
+          </w:tcPr>
+          <w:p>
+            <w:r>
+              <w:rPr>
+                <w:rFonts w:ascii="AppleGothic" w:hAnsi="AppleGothic" w:eastAsia="AppleGothic"/>
+                <w:sz w:val="16"/>
+              </w:rPr>
+              <w:t>0/4건</w:t>
+            </w:r>
+          </w:p>
+        </w:tc>
+        <w:tc>
+          <w:tcPr>
+            <w:tcW w:type="dxa" w:w="2098"/>
+            <w:tcMar>
+              <w:top w:w="100" w:type="dxa"/>
+              <w:start w:w="120" w:type="dxa"/>
+              <w:bottom w:w="100" w:type="dxa"/>
+              <w:end w:w="120" w:type="dxa"/>
+            </w:tcMar>
+            <w:vAlign w:val="center"/>
+          </w:tcPr>
+          <w:p>
+            <w:r>
+              <w:rPr>
+                <w:rFonts w:ascii="AppleGothic" w:hAnsi="AppleGothic" w:eastAsia="AppleGothic"/>
+                <w:sz w:val="16"/>
+              </w:rPr>
+              <w:t>2/12건</w:t>
+            </w:r>
+          </w:p>
+        </w:tc>
+        <w:tc>
+          <w:tcPr>
+            <w:tcW w:type="dxa" w:w="2211"/>
+            <w:tcMar>
+              <w:top w:w="100" w:type="dxa"/>
+              <w:start w:w="120" w:type="dxa"/>
+              <w:bottom w:w="100" w:type="dxa"/>
+              <w:end w:w="120" w:type="dxa"/>
+            </w:tcMar>
+            <w:vAlign w:val="center"/>
+          </w:tcPr>
+          <w:p>
+            <w:r>
+              <w:rPr>
+                <w:rFonts w:ascii="AppleGothic" w:hAnsi="AppleGothic" w:eastAsia="AppleGothic"/>
+                <w:sz w:val="16"/>
+              </w:rPr>
+              <w:t>2/12건</w:t>
+            </w:r>
+          </w:p>
+        </w:tc>
+      </w:tr>
+      <w:tr>
+        <w:tc>
+          <w:tcPr>
+            <w:tcW w:type="dxa" w:w="2948"/>
+            <w:tcMar>
+              <w:top w:w="100" w:type="dxa"/>
+              <w:start w:w="120" w:type="dxa"/>
+              <w:bottom w:w="100" w:type="dxa"/>
+              <w:end w:w="120" w:type="dxa"/>
+            </w:tcMar>
+            <w:vAlign w:val="center"/>
+            <w:shd w:fill="F7F9FC"/>
+          </w:tcPr>
+          <w:p>
+            <w:r>
+              <w:rPr>
+                <w:rFonts w:ascii="AppleGothic" w:hAnsi="AppleGothic" w:eastAsia="AppleGothic"/>
+                <w:sz w:val="16"/>
+              </w:rPr>
+              <w:t>AI 문투 후보 단어 수</w:t>
             </w:r>
           </w:p>
         </w:tc>
@@ -3986,7 +4157,51 @@
                 <w:rFonts w:ascii="AppleGothic" w:hAnsi="AppleGothic" w:eastAsia="AppleGothic"/>
                 <w:sz w:val="16"/>
               </w:rPr>
-              <w:t>1/4건</w:t>
+              <w:t>1개</w:t>
+            </w:r>
+          </w:p>
+        </w:tc>
+        <w:tc>
+          <w:tcPr>
+            <w:tcW w:type="dxa" w:w="2098"/>
+            <w:tcMar>
+              <w:top w:w="100" w:type="dxa"/>
+              <w:start w:w="120" w:type="dxa"/>
+              <w:bottom w:w="100" w:type="dxa"/>
+              <w:end w:w="120" w:type="dxa"/>
+            </w:tcMar>
+            <w:vAlign w:val="center"/>
+            <w:shd w:fill="F7F9FC"/>
+          </w:tcPr>
+          <w:p>
+            <w:r>
+              <w:rPr>
+                <w:rFonts w:ascii="AppleGothic" w:hAnsi="AppleGothic" w:eastAsia="AppleGothic"/>
+                <w:sz w:val="16"/>
+              </w:rPr>
+              <w:t>24개</w:t>
+            </w:r>
+          </w:p>
+        </w:tc>
+        <w:tc>
+          <w:tcPr>
+            <w:tcW w:type="dxa" w:w="2211"/>
+            <w:tcMar>
+              <w:top w:w="100" w:type="dxa"/>
+              <w:start w:w="120" w:type="dxa"/>
+              <w:bottom w:w="100" w:type="dxa"/>
+              <w:end w:w="120" w:type="dxa"/>
+            </w:tcMar>
+            <w:vAlign w:val="center"/>
+            <w:shd w:fill="F7F9FC"/>
+          </w:tcPr>
+          <w:p>
+            <w:r>
+              <w:rPr>
+                <w:rFonts w:ascii="AppleGothic" w:hAnsi="AppleGothic" w:eastAsia="AppleGothic"/>
+                <w:sz w:val="16"/>
+              </w:rPr>
+              <w:t>6개</w:t>
             </w:r>
           </w:p>
         </w:tc>
@@ -3994,7 +4209,7 @@
       <w:tr>
         <w:tc>
           <w:tcPr>
-            <w:tcW w:type="dxa" w:w="3061"/>
+            <w:tcW w:type="dxa" w:w="2948"/>
             <w:tcMar>
               <w:top w:w="100" w:type="dxa"/>
               <w:start w:w="120" w:type="dxa"/>
@@ -4009,7 +4224,7 @@
                 <w:rFonts w:ascii="AppleGothic" w:hAnsi="AppleGothic" w:eastAsia="AppleGothic"/>
                 <w:sz w:val="16"/>
               </w:rPr>
-              <w:t>평가어('깔끔한'·'기본 아이템' 등)가 든 초안</w:t>
+              <w:t>평가어가 든 초안</w:t>
             </w:r>
           </w:p>
         </w:tc>
@@ -4051,13 +4266,13 @@
                 <w:rFonts w:ascii="AppleGothic" w:hAnsi="AppleGothic" w:eastAsia="AppleGothic"/>
                 <w:sz w:val="16"/>
               </w:rPr>
-              <w:t>9/12개</w:t>
+              <w:t>21/36개</w:t>
             </w:r>
           </w:p>
         </w:tc>
         <w:tc>
           <w:tcPr>
-            <w:tcW w:type="dxa" w:w="2098"/>
+            <w:tcW w:type="dxa" w:w="2211"/>
             <w:tcMar>
               <w:top w:w="100" w:type="dxa"/>
               <w:start w:w="120" w:type="dxa"/>
@@ -4072,7 +4287,7 @@
                 <w:rFonts w:ascii="AppleGothic" w:hAnsi="AppleGothic" w:eastAsia="AppleGothic"/>
                 <w:sz w:val="16"/>
               </w:rPr>
-              <w:t>9/12개</w:t>
+              <w:t>14/36개</w:t>
             </w:r>
           </w:p>
         </w:tc>
@@ -4088,7 +4303,7 @@
         <w:rPr>
           <w:rFonts w:ascii="AppleGothic" w:hAnsi="AppleGothic" w:eastAsia="AppleGothic"/>
         </w:rPr>
-        <w:t>2차는 형식 문제를 없앴지만 판매가 26,100원을 '정가'라고 쓰거나 '하루 종일 편하게'처럼 입력에 없는 착용 효과를 단정하는 문장이 새로 생겼다. 3차에서 판매가가 이미 할인이 반영된 금액임을 명시하고 착용 효과와 '정보가 제공되지 않았다'는 문장을 금지해 이런 후보를 4건에서 1건(볼캡의 '부담 없이')으로 줄였다. 다만 평가어가 든 초안이 1/12개에서 9/12개로 늘어, 판매자가 사실 여부를 검토해야 하는 표현이 많아졌다. 평가어 집계는 키워드 개수 기준의 대략적인 지표다.</w:t>
+        <w:t>AI 문투를 피하는 규칙은 blader/humanizer(MIT)의 패턴을 참고해 한국어 광고 문구에 맞게 다시 썼다. AI 문투 후보 단어는 24개에서 6개로, 평가어가 든 초안은 21/36개에서 14/36개로 줄었다. '소재 정보는 제공되지 않았습니다'는 프롬프트로 금지해도 줄지 않았고, 비어 있는 입력 항목을 요청에서 빼자 0/12건이 됐다. 판매가를 '정가'로 쓰는 오류는 판매가가 이미 할인 반영 금액이라고 프롬프트에 밝힌 뒤 사라졌다.</w:t>
       </w:r>
     </w:p>
     <w:p>
@@ -4096,7 +4311,15 @@
         <w:rPr>
           <w:rFonts w:ascii="AppleGothic" w:hAnsi="AppleGothic" w:eastAsia="AppleGothic"/>
         </w:rPr>
-        <w:t>비교에는 다음 한계가 있다. (1) 2·3차는 추론 강도를 낮췄고(1차는 기본값) 응답 시간 차이에는 이 설정이 포함된다. 재실행 12회 중 2회가 30초·45초 제한에서 시간 초과됐고 원인은 확인하지 못했다. (2) 볼캡·할인 홍보 입력의 추가 요청이 말투와 충돌해 2·3차에서 바꿨으므로 두 입력은 1차와 조건이 다르다. (3) 개선 항목을 같은 4개 입력을 읽고 정했기 때문에 이 결과는 독립된 검증이 아니다. (4) 수치는 자동 검사와 Claude Code의 읽기 검토이며 사람 평가가 아니다. 사람 최종 평가는 아직 없다.</w:t>
+        <w:t>남은 문제도 있다. 정가·착용 효과 의심 표현과 소재를 이유로 한 효과가 각각 2/12건 남았고, 평가어가 든 초안도 첫 판(1/12개)보다 많다. 첫 판은 밋밋해서 톤·목적 점수가 낮았다. 최종 판은 광고에 가까워졌지만 판매자가 사실 여부를 확인해야 하는 표현이 늘었다.</w:t>
+      </w:r>
+    </w:p>
+    <w:p>
+      <w:r>
+        <w:rPr>
+          <w:rFonts w:ascii="AppleGothic" w:hAnsi="AppleGothic" w:eastAsia="AppleGothic"/>
+        </w:rPr>
+        <w:t>비교에는 다음 한계가 있다. (1) 판마다 12건이라 작은 차이는 실행마다 달라지는 편차와 구분되지 않는다. (2) 개정판은 추론 강도를 낮췄고(첫 판은 기본값) 응답 시간 차이에는 이 설정이 포함된다. 실제 모델 호출 56회 중 2회가 30초·45초 제한에서 시간 초과됐고 원인은 확인하지 못했다. (3) 볼캡·할인 홍보 입력의 추가 요청이 말투와 충돌해 개정판부터 바꿨으므로 두 입력은 첫 판과 조건이 다르다. (4) 개선 항목을 같은 4개 입력을 읽고 정했기 때문에 이 결과는 독립된 검증이 아니다. (5) 수치는 자동 검사와 키워드 집계, Claude Code의 읽기 검토이며 사람 평가가 아니다. 사람 최종 평가는 아직 없다.</w:t>
       </w:r>
     </w:p>
     <w:p>
@@ -4496,7 +4719,7 @@
                 <w:rFonts w:ascii="AppleGothic" w:hAnsi="AppleGothic" w:eastAsia="AppleGothic"/>
                 <w:sz w:val="16"/>
               </w:rPr>
-              <w:t>108개 자동 검사와 타입·린트·빌드 기록</w:t>
+              <w:t>112개 자동 검사와 타입·린트·빌드 기록</w:t>
             </w:r>
           </w:p>
         </w:tc>
@@ -4637,7 +4860,7 @@
           <w:rFonts w:ascii="AppleGothic" w:hAnsi="AppleGothic" w:eastAsia="AppleGothic"/>
           <w:sz w:val="18"/>
         </w:rPr>
-        <w:t>처음 사용하는 사람의 생성 → 편집 → 저장 흐름을 관찰한다.</w:t>
+        <w:t>처음 사용하는 사람의 생성·편집·저장 흐름을 관찰한다.</w:t>
       </w:r>
     </w:p>
     <w:p>
@@ -4761,7 +4984,7 @@
         <w:rPr>
           <w:rFonts w:ascii="AppleGothic" w:hAnsi="AppleGothic" w:eastAsia="AppleGothic"/>
         </w:rPr>
-        <w:t>Codex의 GPT-6 기반 코딩 에이전트는 요구사항 정리, UI·서버 코드 작성, 테스트, 브라우저 검증, 문서 초안을 지원했다. 2026년 9월 29일에는 Claude Code(Claude Sonnet 5.5)가 결함 수정, 클릭 착용·탈착, 마네킹 핏 검사, 사진 대표색과 상의 앞면 무늬 처리, 문서 정리를 지원했다. 사용자는 서비스 방향, 대상 사용자, 가상 매장 경험, 일정과 교육 API 사용 가능 여부를 결정했다. 개인 업무일지의 배운 점과 소감은 사용자가 자신의 경험으로 보완한다.</w:t>
+        <w:t>Codex의 GPT-6 기반 코딩 에이전트는 요구사항 정리, UI·서버 코드 작성, 테스트, 브라우저 검증, 문서 초안을 지원했다. 2026년 9월 29일 오후부터 30일까지는 Claude Code(Claude Sonnet 5.5)가 결함 수정, 클릭 착용·탈착, 마네킹 핏 검사, 사진 대표색과 상의 앞면 무늬 처리, 광고 프롬프트 개정과 재평가, 문서 정리, GitHub 게시를 지원했다. 문서의 문장은 blader/humanizer(MIT)의 AI 문투 패턴을 기준으로 다듬었고 사실, 수치, 도구 사용 표기는 바꾸지 않았다. 사용자는 서비스 방향, 대상 사용자, 가상 매장 경험, 일정, 교육 API 사용 가능 여부, 평가에 쓸 API 키와 저장소 공개 여부를 결정했다. 개인 업무일지의 배운 점과 소감은 사용자가 자신의 경험으로 보완한다.</w:t>
       </w:r>
     </w:p>
     <w:p>

</xml_diff>

<commit_message>
docs: record the user's overall 3.5/5 rating of the final ad prompt
One overall score given by the developer after reading the 12 drafts and the
flagged expressions; no per-criterion scores were given, and the docs and the
report say so and note that a single rater and one run is not a general result.

Co-Authored-By: Claude Sonnet 5.5 <noreply@anthropic.com>
</commit_message>
<xml_diff>
--- a/docs/report/FITROOM_PROJECT_REPORT.docx
+++ b/docs/report/FITROOM_PROJECT_REPORT.docx
@@ -550,7 +550,7 @@
                 <w:rFonts w:ascii="AppleGothic" w:hAnsi="AppleGothic" w:eastAsia="AppleGothic"/>
                 <w:sz w:val="16"/>
               </w:rPr>
-              <w:t>개정판 12건 생성 성공 · 평균 7.2초 · 사람 평가 대기</w:t>
+              <w:t>개정판 12건 생성 성공 · 평균 7.2초 · 사용자 종합 평가 3.5/5</w:t>
             </w:r>
           </w:p>
         </w:tc>
@@ -4319,7 +4319,15 @@
         <w:rPr>
           <w:rFonts w:ascii="AppleGothic" w:hAnsi="AppleGothic" w:eastAsia="AppleGothic"/>
         </w:rPr>
-        <w:t>비교에는 다음 한계가 있다. (1) 판마다 12건이라 작은 차이는 실행마다 달라지는 편차와 구분되지 않는다. (2) 개정판은 추론 강도를 낮췄고(첫 판은 기본값) 응답 시간 차이에는 이 설정이 포함된다. 실제 모델 호출 56회 중 2회가 30초·45초 제한에서 시간 초과됐고 원인은 확인하지 못했다. (3) 볼캡·할인 홍보 입력의 추가 요청이 말투와 충돌해 개정판부터 바꿨으므로 두 입력은 첫 판과 조건이 다르다. (4) 개선 항목을 같은 4개 입력을 읽고 정했기 때문에 이 결과는 독립된 검증이 아니다. (5) 수치는 자동 검사와 키워드 집계, Claude Code의 읽기 검토이며 사람 평가가 아니다. 사람 최종 평가는 아직 없다.</w:t>
+        <w:t>비교에는 다음 한계가 있다. (1) 판마다 12건이라 작은 차이는 실행마다 달라지는 편차와 구분되지 않는다. (2) 개정판은 추론 강도를 낮췄고(첫 판은 기본값) 응답 시간 차이에는 이 설정이 포함된다. 실제 모델 호출 56회 중 2회가 30초·45초 제한에서 시간 초과됐고 원인은 확인하지 못했다. (3) 볼캡·할인 홍보 입력의 추가 요청이 말투와 충돌해 개정판부터 바꿨으므로 두 입력은 첫 판과 조건이 다르다. (4) 개선 항목을 같은 4개 입력을 읽고 정했기 때문에 이 결과는 독립된 검증이 아니다. (5) 표의 수치는 자동 검사와 키워드 집계, Claude Code의 읽기 검토이며 사람 평가가 아니다.</w:t>
+      </w:r>
+    </w:p>
+    <w:p>
+      <w:r>
+        <w:rPr>
+          <w:rFonts w:ascii="AppleGothic" w:hAnsi="AppleGothic" w:eastAsia="AppleGothic"/>
+        </w:rPr>
+        <w:t>사용자(개발자 본인)가 최종 프롬프트(2026-09-30.5) 첫 실행의 초안 12개를 읽고 종합 3.5/5로 평가했다. 평가어가 든 표현이 나쁘지 않다는 판단이었고 사실 보존, 말투·목적, 활용 가능성의 항목별 점수는 매기지 않았다. 평가자가 한 명이고 12개 초안 한 번의 결과라 서비스 품질 전반을 대표하는 점수로 쓰지 않는다.</w:t>
       </w:r>
     </w:p>
     <w:p>
@@ -4748,7 +4756,7 @@
           <w:rFonts w:ascii="AppleGothic" w:hAnsi="AppleGothic" w:eastAsia="AppleGothic"/>
           <w:sz w:val="18"/>
         </w:rPr>
-        <w:t>실제 API 생성은 평가했지만 사용자 확정 평가와 소상공인 사용성 테스트가 아직 없다.</w:t>
+        <w:t>실제 API 생성은 평가했고 사용자의 종합 평가는 3.5/5지만, 항목별 사람 평가와 소상공인 사용성 테스트는 아직 없다.</w:t>
       </w:r>
     </w:p>
     <w:p>
@@ -4847,7 +4855,7 @@
           <w:rFonts w:ascii="AppleGothic" w:hAnsi="AppleGothic" w:eastAsia="AppleGothic"/>
           <w:sz w:val="18"/>
         </w:rPr>
-        <w:t>사용자가 생성 원문과 보조 점수를 확인해 사람 평가를 확정한다.</w:t>
+        <w:t>사용자가 사실 보존·말투·활용 가능성을 항목별로 채점해 사람 평가를 확정한다.</w:t>
       </w:r>
     </w:p>
     <w:p>

</xml_diff>